<commit_message>
build: justify body text and add numbered pages to thesis template
reference.docx: Normal/BodyText paragraph styles now set w:jc="both",
justifying every body paragraph, list item and blockquote (headings/
captions keep their own alignment). Added a footer with a centered PAGE
field plus a titlePg section setting so the UniBo title page stays
unnumbered and numbering starts on page 2 (the TOC).

Co-Authored-By: Claude Sonnet 5 <noreply@anthropic.com>
Claude-Session: https://claude.ai/code/session_015jDhpsqNv8YoLQo2CNFyn8
</commit_message>
<xml_diff>
--- a/thesis/reference.docx
+++ b/thesis/reference.docx
@@ -382,13 +382,53 @@
 </w:t>
       </w:r>
     </w:p>
-    <w:sectPr/>
+    <w:sectPr>
+      <w:footerReference w:type="default" r:id="rId31"/>
+      <w:footerReference w:type="first" r:id="rId32"/>
+      <w:titlePg/>
+    </w:sectPr>
   </w:body>
 </w:document>
 </file>
 
 <file path=word/comments.xml><?xml version="1.0" encoding="utf-8"?>
 <w:comments xmlns:w="http://schemas.openxmlformats.org/wordprocessingml/2006/main" xmlns:m="http://schemas.openxmlformats.org/officeDocument/2006/math" xmlns:r="http://schemas.openxmlformats.org/officeDocument/2006/relationships" xmlns:o="urn:schemas-microsoft-com:office:office" xmlns:v="urn:schemas-microsoft-com:vml" xmlns:w10="urn:schemas-microsoft-com:office:word" xmlns:a="http://schemas.openxmlformats.org/drawingml/2006/main" xmlns:pic="http://schemas.openxmlformats.org/drawingml/2006/picture" xmlns:wp="http://schemas.openxmlformats.org/drawingml/2006/wordprocessingDrawing"/>
+</file>
+
+<file path=word/footer1.xml><?xml version="1.0" encoding="utf-8"?>
+<w:ftr xmlns:w="http://schemas.openxmlformats.org/wordprocessingml/2006/main">
+  <w:p>
+    <w:pPr>
+      <w:pStyle w:val="Footer"/>
+      <w:jc w:val="center"/>
+    </w:pPr>
+    <w:r>
+      <w:fldChar w:fldCharType="begin"/>
+    </w:r>
+    <w:r>
+      <w:instrText xml:space="preserve"> PAGE </w:instrText>
+    </w:r>
+    <w:r>
+      <w:fldChar w:fldCharType="separate"/>
+    </w:r>
+    <w:r>
+      <w:t>1</w:t>
+    </w:r>
+    <w:r>
+      <w:fldChar w:fldCharType="end"/>
+    </w:r>
+  </w:p>
+</w:ftr>
+</file>
+
+<file path=word/footer2.xml><?xml version="1.0" encoding="utf-8"?>
+<w:ftr xmlns:w="http://schemas.openxmlformats.org/wordprocessingml/2006/main">
+  <w:p>
+    <w:pPr>
+      <w:pStyle w:val="Footer"/>
+    </w:pPr>
+  </w:p>
+</w:ftr>
 </file>
 
 <file path=word/footnotes.xml><?xml version="1.0" encoding="utf-8"?>
@@ -560,6 +600,9 @@
   <w:latentStyles w:defLockedState="0" w:defUIPriority="0" w:defSemiHidden="0" w:defUnhideWhenUsed="0" w:defQFormat="0" w:count="276"/>
   <w:style w:type="paragraph" w:default="1" w:styleId="Normal">
     <w:name w:val="Normal"/>
+    <w:pPr>
+      <w:jc w:val="both"/>
+    </w:pPr>
     <w:qFormat/>
   </w:style>
   <w:style w:type="paragraph" w:styleId="BodyText">
@@ -568,6 +611,7 @@
     <w:link w:val="BodyTextChar"/>
     <w:pPr>
       <w:spacing w:before="180" w:after="180"/>
+      <w:jc w:val="both"/>
     </w:pPr>
     <w:qFormat/>
   </w:style>
@@ -1025,6 +1069,18 @@
       <w:bCs w:val="0"/>
       <w:color w:val="365F91" w:themeColor="accent1" w:themeShade="BF"/>
     </w:rPr>
+  </w:style>
+  <w:style w:type="paragraph" w:styleId="Footer">
+    <w:name w:val="Footer"/>
+    <w:basedOn w:val="Normal"/>
+    <w:qFormat/>
+    <w:pPr>
+      <w:tabs>
+        <w:tab w:val="center" w:pos="4680"/>
+        <w:tab w:val="right" w:pos="9360"/>
+      </w:tabs>
+      <w:jc w:val="left"/>
+    </w:pPr>
   </w:style>
 </w:styles>
 </file>

</xml_diff>